<commit_message>
Deploying to gh-pages from @ eea/CLMS_documents@415d1a6bb3072fbfbbbdfd56be55e01ec6870a0b 🚀
</commit_message>
<xml_diff>
--- a/develop/products/High_Resolution_Layer_Small_Landscape_Features_2021_PUM_v1.docx
+++ b/develop/products/High_Resolution_Layer_Small_Landscape_Features_2021_PUM_v1.docx
@@ -7,7 +7,7 @@
         <w:pStyle w:val="Title"/>
       </w:pPr>
       <w:r>
-        <w:t xml:space="preserve">Copernicus Land Monitoring Service - High Resolution Layer Small Landscape Features</w:t>
+        <w:t xml:space="preserve">High Resolution Layer Small Landscape Features 2021 – Product User Manual</w:t>
       </w:r>
     </w:p>
     <w:p>
@@ -15,7 +15,7 @@
         <w:pStyle w:val="Subtitle"/>
       </w:pPr>
       <w:r>
-        <w:t xml:space="preserve">Product User Manual (PUM)</w:t>
+        <w:t xml:space="preserve">Copernicus Land Monitoring Service</w:t>
       </w:r>
     </w:p>
     <w:p>

</xml_diff>